<commit_message>
Restore original bison proportions in blank.docx
</commit_message>
<xml_diff>
--- a/blank.docx
+++ b/blank.docx
@@ -18,111 +18,131 @@
         </w:tblBorders>
       </w:tblPr>
       <w:tblGrid>
-        <w:gridCol w:w="4422"/>
-        <w:gridCol w:w="5216"/>
+        <w:gridCol w:w="4819"/>
+        <w:gridCol w:w="4819"/>
       </w:tblGrid>
       <w:tr>
         <w:tc>
           <w:tcPr>
-            <w:tcW w:type="dxa" w:w="4819"/>
-            <w:vAlign w:val="top"/>
+            <w:tcW w:type="dxa" w:w="4535"/>
             <w:tcMar>
               <w:top w:w="0" w:type="dxa"/>
               <w:start w:w="0" w:type="dxa"/>
-              <w:bottom w:w="40" w:type="dxa"/>
+              <w:bottom w:w="0" w:type="dxa"/>
               <w:end w:w="0" w:type="dxa"/>
             </w:tcMar>
           </w:tcPr>
           <w:p>
             <w:pPr>
-              <w:spacing w:after="20"/>
+              <w:spacing w:after="60"/>
             </w:pPr>
             <w:r>
               <w:rPr>
-                <w:rFonts w:ascii="Inter" w:hAnsi="Inter"/>
+                <w:rFonts w:ascii="Arial" w:hAnsi="Arial" w:eastAsia="Arial"/>
                 <w:b/>
-                <w:i w:val="0"/>
-                <w:color w:val="2D3031"/>
-                <w:sz w:val="18"/>
+                <w:color w:val="2D3033"/>
+                <w:sz w:val="21"/>
               </w:rPr>
               <w:t xml:space="preserve">Исх. № </w:t>
             </w:r>
             <w:r>
               <w:rPr>
-                <w:rFonts w:ascii="Inter" w:hAnsi="Inter"/>
-                <w:b w:val="0"/>
-                <w:i w:val="0"/>
-                <w:color w:val="A7ACAE"/>
-                <w:sz w:val="18"/>
+                <w:rFonts w:ascii="Arial" w:hAnsi="Arial" w:eastAsia="Arial"/>
+                <w:color w:val="A6ABB0"/>
+                <w:sz w:val="21"/>
               </w:rPr>
               <w:t>[номер]</w:t>
-            </w:r>
-          </w:p>
-          <w:p>
-            <w:pPr>
-              <w:spacing w:before="0" w:after="0"/>
-            </w:pPr>
-            <w:r>
-              <w:rPr>
-                <w:rFonts w:ascii="Inter" w:hAnsi="Inter"/>
-                <w:b w:val="0"/>
-                <w:i w:val="0"/>
-                <w:color w:val="6D7172"/>
-                <w:sz w:val="18"/>
-              </w:rPr>
-              <w:t>от [дата]</w:t>
             </w:r>
           </w:p>
         </w:tc>
         <w:tc>
           <w:tcPr>
-            <w:tcW w:type="dxa" w:w="4819"/>
-            <w:vAlign w:val="top"/>
+            <w:tcW w:type="dxa" w:w="5102"/>
             <w:tcMar>
               <w:top w:w="0" w:type="dxa"/>
               <w:start w:w="0" w:type="dxa"/>
-              <w:bottom w:w="40" w:type="dxa"/>
+              <w:bottom w:w="0" w:type="dxa"/>
               <w:end w:w="0" w:type="dxa"/>
             </w:tcMar>
           </w:tcPr>
           <w:p>
             <w:pPr>
-              <w:spacing w:after="20"/>
+              <w:spacing w:after="40"/>
               <w:jc w:val="right"/>
             </w:pPr>
             <w:r>
               <w:rPr>
-                <w:rFonts w:ascii="Inter" w:hAnsi="Inter"/>
+                <w:rFonts w:ascii="Arial" w:hAnsi="Arial" w:eastAsia="Arial"/>
                 <w:b/>
-                <w:i w:val="0"/>
-                <w:color w:val="2D3031"/>
-                <w:sz w:val="18"/>
+                <w:color w:val="2D3033"/>
+                <w:sz w:val="21"/>
               </w:rPr>
               <w:t xml:space="preserve">Кому: </w:t>
             </w:r>
             <w:r>
               <w:rPr>
-                <w:rFonts w:ascii="Inter" w:hAnsi="Inter"/>
-                <w:b w:val="0"/>
-                <w:i w:val="0"/>
-                <w:color w:val="A7ACAE"/>
-                <w:sz w:val="18"/>
+                <w:rFonts w:ascii="Arial" w:hAnsi="Arial" w:eastAsia="Arial"/>
+                <w:color w:val="A6ABB0"/>
+                <w:sz w:val="21"/>
               </w:rPr>
               <w:t>[организация / ФИО]</w:t>
             </w:r>
           </w:p>
+        </w:tc>
+      </w:tr>
+      <w:tr>
+        <w:tc>
+          <w:tcPr>
+            <w:tcW w:type="dxa" w:w="4535"/>
+            <w:tcMar>
+              <w:top w:w="0" w:type="dxa"/>
+              <w:start w:w="0" w:type="dxa"/>
+              <w:bottom w:w="0" w:type="dxa"/>
+              <w:end w:w="0" w:type="dxa"/>
+            </w:tcMar>
+          </w:tcPr>
           <w:p>
             <w:pPr>
-              <w:spacing w:before="0" w:after="0"/>
+              <w:spacing w:after="0"/>
+            </w:pPr>
+            <w:r>
+              <w:rPr>
+                <w:rFonts w:ascii="Arial" w:hAnsi="Arial" w:eastAsia="Arial"/>
+                <w:b/>
+                <w:color w:val="2D3033"/>
+                <w:sz w:val="21"/>
+              </w:rPr>
+              <w:t xml:space="preserve">Дата: </w:t>
+            </w:r>
+            <w:r>
+              <w:rPr>
+                <w:rFonts w:ascii="Arial" w:hAnsi="Arial" w:eastAsia="Arial"/>
+                <w:color w:val="A6ABB0"/>
+                <w:sz w:val="21"/>
+              </w:rPr>
+              <w:t>[дата]</w:t>
+            </w:r>
+          </w:p>
+        </w:tc>
+        <w:tc>
+          <w:tcPr>
+            <w:tcW w:type="dxa" w:w="5102"/>
+            <w:tcMar>
+              <w:top w:w="0" w:type="dxa"/>
+              <w:start w:w="0" w:type="dxa"/>
+              <w:bottom w:w="0" w:type="dxa"/>
+              <w:end w:w="0" w:type="dxa"/>
+            </w:tcMar>
+          </w:tcPr>
+          <w:p>
+            <w:pPr>
               <w:jc w:val="right"/>
             </w:pPr>
             <w:r>
               <w:rPr>
-                <w:rFonts w:ascii="Inter" w:hAnsi="Inter"/>
-                <w:b w:val="0"/>
-                <w:i w:val="0"/>
-                <w:color w:val="A7ACAE"/>
-                <w:sz w:val="18"/>
+                <w:rFonts w:ascii="Arial" w:hAnsi="Arial" w:eastAsia="Arial"/>
+                <w:color w:val="A6ABB0"/>
+                <w:sz w:val="21"/>
               </w:rPr>
               <w:t>[должность / адресат]</w:t>
             </w:r>
@@ -132,96 +152,42 @@
     </w:tbl>
     <w:p>
       <w:pPr>
-        <w:spacing w:before="280" w:after="240"/>
+        <w:spacing w:before="360" w:after="120"/>
         <w:pBdr>
-          <w:bottom w:val="single" w:sz="6" w:space="4" w:color="CB1F24"/>
+          <w:bottom w:val="single" w:sz="6" w:space="4" w:color="C9221C"/>
         </w:pBdr>
       </w:pPr>
       <w:r>
         <w:rPr>
-          <w:rFonts w:ascii="Inter" w:hAnsi="Inter"/>
+          <w:rFonts w:ascii="Arial" w:hAnsi="Arial" w:eastAsia="Arial"/>
           <w:b/>
-          <w:i w:val="0"/>
-          <w:color w:val="2D3031"/>
-          <w:sz w:val="19"/>
+          <w:color w:val="2D3033"/>
+          <w:sz w:val="22"/>
         </w:rPr>
         <w:t xml:space="preserve">ТЕМА: </w:t>
       </w:r>
       <w:r>
         <w:rPr>
-          <w:rFonts w:ascii="Inter" w:hAnsi="Inter"/>
-          <w:b w:val="0"/>
-          <w:i w:val="0"/>
-          <w:color w:val="A7ACAE"/>
-          <w:sz w:val="19"/>
+          <w:rFonts w:ascii="Arial" w:hAnsi="Arial" w:eastAsia="Arial"/>
+          <w:color w:val="A6ABB0"/>
+          <w:sz w:val="22"/>
         </w:rPr>
         <w:t>[укажите тему письма]</w:t>
       </w:r>
     </w:p>
     <w:p>
       <w:pPr>
-        <w:spacing w:before="80" w:after="0"/>
+        <w:spacing w:before="200"/>
       </w:pPr>
       <w:r>
         <w:rPr>
-          <w:rFonts w:ascii="Inter" w:hAnsi="Inter"/>
-          <w:b w:val="0"/>
+          <w:rFonts w:ascii="Arial" w:hAnsi="Arial" w:eastAsia="Arial"/>
           <w:i/>
-          <w:color w:val="A7ACAE"/>
-          <w:sz w:val="21"/>
+          <w:color w:val="A6ABB0"/>
+          <w:sz w:val="22"/>
         </w:rPr>
         <w:t>[Текст письма]</w:t>
       </w:r>
-    </w:p>
-    <w:p>
-      <w:pPr>
-        <w:spacing w:after="120"/>
-      </w:pPr>
-    </w:p>
-    <w:p>
-      <w:pPr>
-        <w:spacing w:after="120"/>
-      </w:pPr>
-    </w:p>
-    <w:p>
-      <w:pPr>
-        <w:spacing w:after="120"/>
-      </w:pPr>
-    </w:p>
-    <w:p>
-      <w:pPr>
-        <w:spacing w:after="120"/>
-      </w:pPr>
-    </w:p>
-    <w:p>
-      <w:pPr>
-        <w:spacing w:after="120"/>
-      </w:pPr>
-    </w:p>
-    <w:p>
-      <w:pPr>
-        <w:spacing w:after="120"/>
-      </w:pPr>
-    </w:p>
-    <w:p>
-      <w:pPr>
-        <w:spacing w:after="120"/>
-      </w:pPr>
-    </w:p>
-    <w:p>
-      <w:pPr>
-        <w:spacing w:after="120"/>
-      </w:pPr>
-    </w:p>
-    <w:p>
-      <w:pPr>
-        <w:spacing w:after="120"/>
-      </w:pPr>
-    </w:p>
-    <w:p>
-      <w:pPr>
-        <w:spacing w:after="120"/>
-      </w:pPr>
     </w:p>
     <w:p>
       <w:pPr>
@@ -229,7 +195,7 @@
           <w:headerReference w:type="first" r:id="rId9"/>
           <w:footerReference w:type="first" r:id="rId10"/>
           <w:pgSz w:w="11906" w:h="16838"/>
-          <w:pgMar w:top="2608" w:right="1134" w:bottom="1134" w:left="1134" w:header="0" w:footer="454" w:gutter="0"/>
+          <w:pgMar w:top="2438" w:right="1134" w:bottom="1020" w:left="1134" w:header="312" w:footer="312" w:gutter="0"/>
           <w:cols w:space="720"/>
           <w:titlePg/>
           <w:docGrid w:linePitch="360"/>
@@ -238,84 +204,23 @@
     </w:p>
     <w:p>
       <w:pPr>
-        <w:spacing w:before="40" w:after="0"/>
+        <w:spacing w:after="0"/>
       </w:pPr>
       <w:r>
         <w:rPr>
-          <w:rFonts w:ascii="Inter" w:hAnsi="Inter"/>
-          <w:b w:val="0"/>
+          <w:rFonts w:ascii="Arial" w:hAnsi="Arial" w:eastAsia="Arial"/>
           <w:i/>
-          <w:color w:val="A7ACAE"/>
-          <w:sz w:val="21"/>
+          <w:color w:val="A6ABB0"/>
+          <w:sz w:val="22"/>
         </w:rPr>
         <w:t>[Продолжение текста письма]</w:t>
       </w:r>
-    </w:p>
-    <w:p>
-      <w:pPr>
-        <w:spacing w:after="140"/>
-      </w:pPr>
-    </w:p>
-    <w:p>
-      <w:pPr>
-        <w:spacing w:after="140"/>
-      </w:pPr>
-    </w:p>
-    <w:p>
-      <w:pPr>
-        <w:spacing w:after="140"/>
-      </w:pPr>
-    </w:p>
-    <w:p>
-      <w:pPr>
-        <w:spacing w:after="140"/>
-      </w:pPr>
-    </w:p>
-    <w:p>
-      <w:pPr>
-        <w:spacing w:after="140"/>
-      </w:pPr>
-    </w:p>
-    <w:p>
-      <w:pPr>
-        <w:spacing w:after="140"/>
-      </w:pPr>
-    </w:p>
-    <w:p>
-      <w:pPr>
-        <w:spacing w:after="140"/>
-      </w:pPr>
-    </w:p>
-    <w:p>
-      <w:pPr>
-        <w:spacing w:after="140"/>
-      </w:pPr>
-    </w:p>
-    <w:p>
-      <w:pPr>
-        <w:spacing w:after="140"/>
-      </w:pPr>
-    </w:p>
-    <w:p>
-      <w:pPr>
-        <w:spacing w:after="140"/>
-      </w:pPr>
-    </w:p>
-    <w:p>
-      <w:pPr>
-        <w:spacing w:after="140"/>
-      </w:pPr>
-    </w:p>
-    <w:p>
-      <w:pPr>
-        <w:spacing w:after="140"/>
-      </w:pPr>
     </w:p>
     <w:sectPr>
       <w:headerReference w:type="default" r:id="rId11"/>
       <w:footerReference w:type="default" r:id="rId12"/>
       <w:pgSz w:w="11906" w:h="16838"/>
-      <w:pgMar w:top="1417" w:right="1134" w:bottom="1134" w:left="1134" w:header="397" w:footer="454" w:gutter="0"/>
+      <w:pgMar w:top="1332" w:right="1134" w:bottom="1020" w:left="1134" w:header="369" w:footer="369" w:gutter="0"/>
       <w:cols w:space="720"/>
       <w:docGrid w:linePitch="360"/>
     </w:sectPr>
@@ -328,18 +233,14 @@
   <w:p>
     <w:pPr>
       <w:pStyle w:val="Footer"/>
+      <w:spacing w:before="0" w:after="0"/>
       <w:jc w:val="center"/>
-      <w:pBdr>
-        <w:bottom w:val="single" w:sz="4" w:space="3" w:color="D7DADB"/>
-      </w:pBdr>
     </w:pPr>
     <w:r>
       <w:rPr>
-        <w:rFonts w:ascii="Inter" w:hAnsi="Inter"/>
-        <w:b w:val="0"/>
-        <w:i w:val="0"/>
-        <w:color w:val="6D7172"/>
-        <w:sz w:val="14"/>
+        <w:rFonts w:ascii="Arial" w:hAnsi="Arial" w:eastAsia="Arial"/>
+        <w:color w:val="8B9095"/>
+        <w:sz w:val="15"/>
       </w:rPr>
       <w:t>ИНН 6732227339  |  КПП 772701001  |  ОГРН 1226700005927  |  ПАО Сбербанк  |  р/с 40702810847000009762  |  БИК 045402601</w:t>
     </w:r>
@@ -356,32 +257,22 @@
     </w:pPr>
     <w:r>
       <w:rPr>
-        <w:rFonts w:ascii="Inter" w:hAnsi="Inter"/>
-        <w:b w:val="0"/>
-        <w:i w:val="0"/>
-        <w:color w:val="6D7172"/>
-        <w:sz w:val="16"/>
+        <w:rFonts w:ascii="Arial" w:hAnsi="Arial" w:eastAsia="Arial"/>
+        <w:color w:val="8B9095"/>
+        <w:sz w:val="17"/>
       </w:rPr>
       <w:t xml:space="preserve">Страница </w:t>
+    </w:r>
+    <w:r>
+      <w:rPr>
+        <w:rFonts w:ascii="Arial" w:hAnsi="Arial" w:eastAsia="Arial"/>
+        <w:color w:val="8B9095"/>
+        <w:sz w:val="17"/>
+      </w:rPr>
       <w:fldChar w:fldCharType="begin"/>
       <w:instrText xml:space="preserve"> PAGE </w:instrText>
       <w:fldChar w:fldCharType="separate"/>
-      <w:t>1</w:t>
-      <w:fldChar w:fldCharType="end"/>
-    </w:r>
-    <w:r>
-      <w:rPr>
-        <w:rFonts w:ascii="Inter" w:hAnsi="Inter"/>
-        <w:b w:val="0"/>
-        <w:i w:val="0"/>
-        <w:color w:val="6D7172"/>
-        <w:sz w:val="16"/>
-      </w:rPr>
-      <w:t xml:space="preserve"> из </w:t>
-      <w:fldChar w:fldCharType="begin"/>
-      <w:instrText xml:space="preserve"> NUMPAGES </w:instrText>
-      <w:fldChar w:fldCharType="separate"/>
-      <w:t>1</w:t>
+      <w:t>2</w:t>
       <w:fldChar w:fldCharType="end"/>
     </w:r>
   </w:p>
@@ -393,45 +284,145 @@
   <w:p>
     <w:pPr>
       <w:pStyle w:val="Header"/>
-      <w:spacing w:before="0" w:after="0"/>
-      <w:ind w:left="-1134" w:right="-1134"/>
+      <w:spacing w:after="0"/>
+    </w:pPr>
+    <w:r/>
+  </w:p>
+  <w:tbl>
+    <w:tblPr>
+      <w:tblW w:type="auto" w:w="0"/>
       <w:jc w:val="center"/>
-    </w:pPr>
-    <w:r>
-      <w:drawing>
-        <wp:inline xmlns:a="http://schemas.openxmlformats.org/drawingml/2006/main" xmlns:pic="http://schemas.openxmlformats.org/drawingml/2006/picture">
-          <wp:extent cx="7560000" cy="1438839"/>
-          <wp:docPr id="1" name="Picture 1"/>
-          <wp:cNvGraphicFramePr>
-            <a:graphicFrameLocks noChangeAspect="1"/>
-          </wp:cNvGraphicFramePr>
-          <a:graphic>
-            <a:graphicData uri="http://schemas.openxmlformats.org/drawingml/2006/picture">
-              <pic:pic>
-                <pic:nvPicPr>
-                  <pic:cNvPr id="0" name="header_first_clean.png"/>
-                  <pic:cNvPicPr/>
-                </pic:nvPicPr>
-                <pic:blipFill>
-                  <a:blip r:embed="rId1"/>
-                  <a:stretch>
-                    <a:fillRect/>
-                  </a:stretch>
-                </pic:blipFill>
-                <pic:spPr>
-                  <a:xfrm>
-                    <a:off x="0" y="0"/>
-                    <a:ext cx="7560000" cy="1438839"/>
-                  </a:xfrm>
-                  <a:prstGeom prst="rect"/>
-                </pic:spPr>
-              </pic:pic>
-            </a:graphicData>
-          </a:graphic>
-        </wp:inline>
-      </w:drawing>
-    </w:r>
-  </w:p>
+      <w:tblLayout w:type="fixed"/>
+      <w:tblLook w:firstColumn="1" w:firstRow="1" w:lastColumn="0" w:lastRow="0" w:noHBand="0" w:noVBand="1" w:val="04A0"/>
+      <w:tblBorders>
+        <w:top w:val="nil"/>
+        <w:left w:val="nil"/>
+        <w:bottom w:val="single" w:sz="12" w:space="0" w:color="C9221C"/>
+        <w:right w:val="nil"/>
+        <w:insideH w:val="nil"/>
+        <w:insideV w:val="nil"/>
+      </w:tblBorders>
+    </w:tblPr>
+    <w:tblGrid>
+      <w:gridCol w:w="4819"/>
+      <w:gridCol w:w="4819"/>
+    </w:tblGrid>
+    <w:tr>
+      <w:tc>
+        <w:tcPr>
+          <w:tcW w:type="dxa" w:w="3061"/>
+          <w:vAlign w:val="center"/>
+          <w:tcMar>
+            <w:top w:w="40" w:type="dxa"/>
+            <w:start w:w="0" w:type="dxa"/>
+            <w:bottom w:w="60" w:type="dxa"/>
+            <w:end w:w="100" w:type="dxa"/>
+          </w:tcMar>
+        </w:tcPr>
+        <w:p>
+          <w:pPr>
+            <w:spacing w:after="0"/>
+            <w:jc w:val="left"/>
+          </w:pPr>
+          <w:r>
+            <w:drawing>
+              <wp:inline xmlns:a="http://schemas.openxmlformats.org/drawingml/2006/main" xmlns:pic="http://schemas.openxmlformats.org/drawingml/2006/picture">
+                <wp:extent cx="1800000" cy="1013038"/>
+                <wp:docPr id="1" name="Picture 1"/>
+                <wp:cNvGraphicFramePr>
+                  <a:graphicFrameLocks noChangeAspect="1"/>
+                </wp:cNvGraphicFramePr>
+                <a:graphic>
+                  <a:graphicData uri="http://schemas.openxmlformats.org/drawingml/2006/picture">
+                    <pic:pic>
+                      <pic:nvPicPr>
+                        <pic:cNvPr id="0" name="ChatGPT Image 16 сент. 2026 г., 22_59_29 (1).png"/>
+                        <pic:cNvPicPr/>
+                      </pic:nvPicPr>
+                      <pic:blipFill>
+                        <a:blip r:embed="rId1"/>
+                        <a:stretch>
+                          <a:fillRect/>
+                        </a:stretch>
+                      </pic:blipFill>
+                      <pic:spPr>
+                        <a:xfrm>
+                          <a:off x="0" y="0"/>
+                          <a:ext cx="1800000" cy="1013038"/>
+                        </a:xfrm>
+                        <a:prstGeom prst="rect"/>
+                      </pic:spPr>
+                    </pic:pic>
+                  </a:graphicData>
+                </a:graphic>
+              </wp:inline>
+            </w:drawing>
+          </w:r>
+        </w:p>
+      </w:tc>
+      <w:tc>
+        <w:tcPr>
+          <w:tcW w:type="dxa" w:w="6576"/>
+          <w:vAlign w:val="center"/>
+          <w:tcMar>
+            <w:top w:w="30" w:type="dxa"/>
+            <w:start w:w="120" w:type="dxa"/>
+            <w:bottom w:w="60" w:type="dxa"/>
+            <w:end w:w="0" w:type="dxa"/>
+          </w:tcMar>
+        </w:tcPr>
+        <w:p>
+          <w:pPr>
+            <w:spacing w:after="0"/>
+            <w:jc w:val="right"/>
+          </w:pPr>
+          <w:r>
+            <w:rPr>
+              <w:rFonts w:ascii="Arial" w:hAnsi="Arial" w:eastAsia="Arial"/>
+              <w:b/>
+              <w:color w:val="2D3033"/>
+              <w:sz w:val="30"/>
+            </w:rPr>
+            <w:t>ООО «ЗУБРСПЕЦСТРОЙ»</w:t>
+          </w:r>
+          <w:r>
+            <w:br/>
+          </w:r>
+          <w:r>
+            <w:rPr>
+              <w:rFonts w:ascii="Arial" w:hAnsi="Arial" w:eastAsia="Arial"/>
+              <w:b w:val="0"/>
+              <w:color w:val="8B9095"/>
+              <w:sz w:val="17"/>
+            </w:rPr>
+            <w:t>СТРОИТЕЛЬНАЯ КОМПАНИЯ</w:t>
+          </w:r>
+          <w:r>
+            <w:br/>
+          </w:r>
+          <w:r>
+            <w:rPr>
+              <w:rFonts w:ascii="Arial" w:hAnsi="Arial" w:eastAsia="Arial"/>
+              <w:color w:val="2D3033"/>
+              <w:sz w:val="17"/>
+            </w:rPr>
+            <w:t>+7 995 996-07-44  |  zubrspecstroy@gmail.com</w:t>
+          </w:r>
+          <w:r>
+            <w:br/>
+          </w:r>
+          <w:r>
+            <w:rPr>
+              <w:rFonts w:ascii="Arial" w:hAnsi="Arial" w:eastAsia="Arial"/>
+              <w:color w:val="8B9095"/>
+              <w:sz w:val="15"/>
+            </w:rPr>
+            <w:t>117218, г. Москва, ул. Большая Черемушкинская, д. 34, этаж 3, ком. 310.3</w:t>
+          </w:r>
+        </w:p>
+      </w:tc>
+    </w:tr>
+  </w:tbl>
 </w:hdr>
 </file>
 
@@ -440,34 +431,55 @@
   <w:p>
     <w:pPr>
       <w:pStyle w:val="Header"/>
-      <w:spacing w:before="0" w:after="40"/>
-      <w:pBdr>
-        <w:bottom w:val="single" w:sz="4" w:space="2" w:color="CB1F24"/>
-      </w:pBdr>
-    </w:pPr>
-    <w:r>
-      <w:rPr>
-        <w:rFonts w:ascii="Inter" w:hAnsi="Inter"/>
-        <w:b w:val="0"/>
-        <w:i w:val="0"/>
-        <w:color w:val="A7ACAE"/>
-        <w:sz w:val="18"/>
-      </w:rPr>
-      <w:t>ООО "ЗУБРСПЕЦСТРОЙ" | Официальный бланк</w:t>
-    </w:r>
+      <w:spacing w:after="0"/>
+    </w:pPr>
+    <w:r/>
   </w:p>
-  <w:p>
-    <w:pPr>
-      <w:spacing w:before="0" w:after="0"/>
-    </w:pPr>
-    <w:r>
-      <w:pict>
-        <v:shape id="ZubrBlueprintWatermark" type="#_x0000_t75" stroked="f" style="position:absolute;margin-left:0pt;margin-top:45pt;width:480pt;height:620pt;z-index:-251654144;mso-position-horizontal:center;mso-position-horizontal-relative:page;mso-position-vertical:top;mso-position-vertical-relative:page">
-          <v:imagedata r:id="rId1" o:title="Blueprint watermark"/>
-        </v:shape>
-      </w:pict>
-    </w:r>
-  </w:p>
+  <w:tbl>
+    <w:tblPr>
+      <w:tblW w:type="auto" w:w="0"/>
+      <w:jc w:val="center"/>
+      <w:tblLayout w:type="fixed"/>
+      <w:tblLook w:firstColumn="1" w:firstRow="1" w:lastColumn="0" w:lastRow="0" w:noHBand="0" w:noVBand="1" w:val="04A0"/>
+      <w:tblBorders>
+        <w:top w:val="nil"/>
+        <w:left w:val="nil"/>
+        <w:bottom w:val="single" w:sz="4" w:space="0" w:color="C9221C"/>
+        <w:right w:val="nil"/>
+        <w:insideH w:val="nil"/>
+        <w:insideV w:val="nil"/>
+      </w:tblBorders>
+    </w:tblPr>
+    <w:tblGrid>
+      <w:gridCol w:w="9638"/>
+    </w:tblGrid>
+    <w:tr>
+      <w:tc>
+        <w:tcPr>
+          <w:tcW w:type="dxa" w:w="9638"/>
+          <w:tcMar>
+            <w:top w:w="0" w:type="dxa"/>
+            <w:start w:w="0" w:type="dxa"/>
+            <w:bottom w:w="45" w:type="dxa"/>
+            <w:end w:w="0" w:type="dxa"/>
+          </w:tcMar>
+        </w:tcPr>
+        <w:p>
+          <w:pPr>
+            <w:jc w:val="left"/>
+          </w:pPr>
+          <w:r>
+            <w:rPr>
+              <w:rFonts w:ascii="Arial" w:hAnsi="Arial" w:eastAsia="Arial"/>
+              <w:color w:val="A6ABB0"/>
+              <w:sz w:val="18"/>
+            </w:rPr>
+            <w:t>ООО "ЗУБРСПЕЦСТРОЙ" | Официальный бланк</w:t>
+          </w:r>
+        </w:p>
+      </w:tc>
+    </w:tr>
+  </w:tbl>
 </w:hdr>
 </file>
 
@@ -834,13 +846,10 @@
     <w:name w:val="Normal"/>
     <w:qFormat/>
     <w:rsid w:val="00FC693F"/>
-    <w:pPr>
-      <w:spacing w:line="269" w:lineRule="auto" w:after="80"/>
-    </w:pPr>
     <w:rPr>
-      <w:rFonts w:ascii="Inter" w:hAnsi="Inter"/>
-      <w:color w:val="2D3031"/>
-      <w:sz w:val="21"/>
+      <w:rFonts w:ascii="Arial" w:hAnsi="Arial" w:eastAsia="Arial"/>
+      <w:color w:val="2D3033"/>
+      <w:sz w:val="22"/>
     </w:rPr>
   </w:style>
   <w:style w:type="paragraph" w:styleId="Header">

</xml_diff>